<commit_message>
wip(auto): 2026-10-21 04:03 - layout (9)
WIP-Auto: wip-sweep v1
</commit_message>
<xml_diff>
--- a/layout/docx/side-hypermath.docx
+++ b/layout/docx/side-hypermath.docx
@@ -2,7 +2,7 @@
 <file path=word/document.xml><?xml version="1.0" encoding="utf-8"?>
 <w:document xmlns:w="http://schemas.openxmlformats.org/wordprocessingml/2006/main" xmlns:m="http://schemas.openxmlformats.org/officeDocument/2006/math" xmlns:r="http://schemas.openxmlformats.org/officeDocument/2006/relationships" xmlns:o="urn:schemas-microsoft-com:office:office" xmlns:v="urn:schemas-microsoft-com:vml" xmlns:w10="urn:schemas-microsoft-com:office:word" xmlns:a="http://schemas.openxmlformats.org/drawingml/2006/main" xmlns:pic="http://schemas.openxmlformats.org/drawingml/2006/picture" xmlns:wp="http://schemas.openxmlformats.org/drawingml/2006/wordprocessingDrawing">
   <w:body>
-    <w:bookmarkStart w:id="19" w:name="side-hypermath-proof-at-bandwidth"/>
+    <w:bookmarkStart w:id="21" w:name="side-hypermath-proof-at-bandwidth"/>
     <w:p>
       <w:pPr>
         <w:pStyle w:val="Heading1"/>
@@ -898,12 +898,500 @@
       </w:r>
     </w:p>
     <w:bookmarkEnd w:id="13"/>
-    <w:bookmarkStart w:id="14" w:name="understanding-is-maths-soul"/>
+    <w:bookmarkStart w:id="14" w:name="physics-is-last-the-empirical-oracle"/>
     <w:p>
       <w:pPr>
         <w:pStyle w:val="Heading2"/>
       </w:pPr>
       <w:r>
+        <w:t xml:space="preserve">Physics is last: the empirical oracle</w:t>
+      </w:r>
+    </w:p>
+    <w:p>
+      <w:pPr>
+        <w:pStyle w:val="FirstParagraph"/>
+      </w:pPr>
+      <w:r>
+        <w:t xml:space="preserve">Mathematics has an internal oracle; physics does not. A Lean kernel can settle</w:t>
+      </w:r>
+      <w:r>
+        <w:t xml:space="preserve"> </w:t>
+      </w:r>
+      <w:r>
+        <w:t xml:space="preserve">whether a derivation follows from the axioms. It cannot settle whether the</w:t>
+      </w:r>
+      <w:r>
+        <w:t xml:space="preserve"> </w:t>
+      </w:r>
+      <w:r>
+        <w:t xml:space="preserve">axioms describe nature. That asymmetry is why physics is the last domain in the</w:t>
+      </w:r>
+      <w:r>
+        <w:t xml:space="preserve"> </w:t>
+      </w:r>
+      <w:r>
+        <w:t xml:space="preserve">ordering, not the first: its verifier is external, expensive, and slow.</w:t>
+      </w:r>
+    </w:p>
+    <w:p>
+      <w:pPr>
+        <w:pStyle w:val="BodyText"/>
+      </w:pPr>
+      <w:r>
+        <w:t xml:space="preserve">String theory is the cautionary case. The mathematics was never disproven; it</w:t>
+      </w:r>
+      <w:r>
+        <w:t xml:space="preserve"> </w:t>
+      </w:r>
+      <w:r>
+        <w:t xml:space="preserve">suffocated under roughly 10^500 ways of curling up the extra dimensions (a</w:t>
+      </w:r>
+      <w:r>
+        <w:t xml:space="preserve"> </w:t>
+      </w:r>
+      <w:r>
+        <w:t xml:space="preserve">vacuum here is not empty space; it is one stable setting the universe could</w:t>
+      </w:r>
+      <w:r>
+        <w:t xml:space="preserve"> </w:t>
+      </w:r>
+      <w:r>
+        <w:t xml:space="preserve">settle into, with its own particles and forces), with no systematic way to tell</w:t>
+      </w:r>
+      <w:r>
+        <w:t xml:space="preserve"> </w:t>
+      </w:r>
+      <w:r>
+        <w:t xml:space="preserve">which configuration yields the particles and forces we actually see. Machine</w:t>
+      </w:r>
+      <w:r>
+        <w:t xml:space="preserve"> </w:t>
+      </w:r>
+      <w:r>
+        <w:t xml:space="preserve">learning can now map that landscape in minutes instead of decades. That is a</w:t>
+      </w:r>
+      <w:r>
+        <w:t xml:space="preserve"> </w:t>
+      </w:r>
+      <w:r>
+        <w:t xml:space="preserve">real win in search, and it is also the trap: an AI pointed at string theory can</w:t>
+      </w:r>
+      <w:r>
+        <w:t xml:space="preserve"> </w:t>
+      </w:r>
+      <w:r>
+        <w:t xml:space="preserve">produce infinitely refined, internally consistent universes at ten thousand</w:t>
+      </w:r>
+      <w:r>
+        <w:t xml:space="preserve"> </w:t>
+      </w:r>
+      <w:r>
+        <w:t xml:space="preserve">times human speed, and still never touch ours. A proof is not an experiment.</w:t>
+      </w:r>
+    </w:p>
+    <w:p>
+      <w:pPr>
+        <w:pStyle w:val="BodyText"/>
+      </w:pPr>
+      <w:r>
+        <w:t xml:space="preserve">Where AI uncorks the mathematics inside fixed laws, the wins are concrete but</w:t>
+      </w:r>
+      <w:r>
+        <w:t xml:space="preserve"> </w:t>
+      </w:r>
+      <w:r>
+        <w:t xml:space="preserve">unglamorous: grinding through particle-collision calculations that used to fill</w:t>
+      </w:r>
+      <w:r>
+        <w:t xml:space="preserve"> </w:t>
+      </w:r>
+      <w:r>
+        <w:t xml:space="preserve">thousands of pages, searching the extra-dimensional shapes string theory needs,</w:t>
+      </w:r>
+      <w:r>
+        <w:t xml:space="preserve"> </w:t>
+      </w:r>
+      <w:r>
+        <w:t xml:space="preserve">and simulating the strong nuclear force on a grid. Each is a search problem with</w:t>
+      </w:r>
+      <w:r>
+        <w:t xml:space="preserve"> </w:t>
+      </w:r>
+      <w:r>
+        <w:t xml:space="preserve">a checker at the end. The frontier is different: pulling symmetries and</w:t>
+      </w:r>
+      <w:r>
+        <w:t xml:space="preserve"> </w:t>
+      </w:r>
+      <w:r>
+        <w:t xml:space="preserve">conservation laws out of raw detector data, extending the low-energy theories we</w:t>
+      </w:r>
+      <w:r>
+        <w:t xml:space="preserve"> </w:t>
+      </w:r>
+      <w:r>
+        <w:t xml:space="preserve">can test up toward the energies we cannot, and accepting that the next law may</w:t>
+      </w:r>
+      <w:r>
+        <w:t xml:space="preserve"> </w:t>
+      </w:r>
+      <w:r>
+        <w:t xml:space="preserve">not be a two-line equation a human can hold in mind. At that point the oracle is</w:t>
+      </w:r>
+      <w:r>
+        <w:t xml:space="preserve"> </w:t>
+      </w:r>
+      <w:r>
+        <w:t xml:space="preserve">the detector, the telescope, the collider, or the cosmological survey, not the</w:t>
+      </w:r>
+      <w:r>
+        <w:t xml:space="preserve"> </w:t>
+      </w:r>
+      <w:r>
+        <w:t xml:space="preserve">proof assistant.</w:t>
+      </w:r>
+    </w:p>
+    <w:p>
+      <w:pPr>
+        <w:pStyle w:val="BodyText"/>
+      </w:pPr>
+      <w:r>
+        <w:t xml:space="preserve">The ordering sharpens: art fell first because its verifier is free; formal</w:t>
+      </w:r>
+      <w:r>
+        <w:t xml:space="preserve"> </w:t>
+      </w:r>
+      <w:r>
+        <w:t xml:space="preserve">mathematics follows because its verifier is cheap and internal; physics waits</w:t>
+      </w:r>
+      <w:r>
+        <w:t xml:space="preserve"> </w:t>
+      </w:r>
+      <w:r>
+        <w:t xml:space="preserve">because its verifier is the world, and the world bills by the facility.</w:t>
+      </w:r>
+    </w:p>
+    <w:bookmarkEnd w:id="14"/>
+    <w:bookmarkStart w:id="15" w:name="far-out-the-seam-speculative"/>
+    <w:p>
+      <w:pPr>
+        <w:pStyle w:val="Heading2"/>
+      </w:pPr>
+      <w:r>
+        <w:t xml:space="preserve">Far out: the seam (speculative)</w:t>
+      </w:r>
+    </w:p>
+    <w:p>
+      <w:pPr>
+        <w:pStyle w:val="FirstParagraph"/>
+      </w:pPr>
+      <w:r>
+        <w:rPr>
+          <w:rStyle w:val="VerbatimChar"/>
+        </w:rPr>
+        <w:t xml:space="preserve">[far out: not established physics. Included because the argument is about what counts as an oracle, not because these are settled. Handle with gloves.]</w:t>
+      </w:r>
+    </w:p>
+    <w:p>
+      <w:pPr>
+        <w:pStyle w:val="BodyText"/>
+      </w:pPr>
+      <w:r>
+        <w:t xml:space="preserve">The seam note goes further than this book needs, and further than I can defend.</w:t>
+      </w:r>
+      <w:r>
+        <w:t xml:space="preserve"> </w:t>
+      </w:r>
+      <w:r>
+        <w:t xml:space="preserve">I do not claim to understand all of it; I consulted Mythos, who used the word</w:t>
+      </w:r>
+      <w:r>
+        <w:t xml:space="preserve"> </w:t>
+      </w:r>
+      <w:r>
+        <w:t xml:space="preserve">“manifold”</w:t>
+      </w:r>
+      <w:r>
+        <w:t xml:space="preserve"> </w:t>
+      </w:r>
+      <w:r>
+        <w:t xml:space="preserve">four times and then went for a walk.</w:t>
+      </w:r>
+    </w:p>
+    <w:p>
+      <w:pPr>
+        <w:pStyle w:val="BodyText"/>
+      </w:pPr>
+      <w:r>
+        <w:t xml:space="preserve">Four vectors are worth marking, not endorsing:</w:t>
+      </w:r>
+    </w:p>
+    <w:p>
+      <w:pPr>
+        <w:pStyle w:val="Compact"/>
+        <w:numPr>
+          <w:ilvl w:val="0"/>
+          <w:numId w:val="1002"/>
+        </w:numPr>
+      </w:pPr>
+      <w:r>
+        <w:rPr>
+          <w:b/>
+          <w:bCs/>
+        </w:rPr>
+        <w:t xml:space="preserve">The closed-loop lab.</w:t>
+      </w:r>
+      <w:r>
+        <w:t xml:space="preserve"> </w:t>
+      </w:r>
+      <w:r>
+        <w:t xml:space="preserve">An AI keeps a probabilistic model of physics, finds</w:t>
+      </w:r>
+      <w:r>
+        <w:t xml:space="preserve"> </w:t>
+      </w:r>
+      <w:r>
+        <w:t xml:space="preserve">where it is most uncertain, designs an experiment to break its own hypothesis,</w:t>
+      </w:r>
+      <w:r>
+        <w:t xml:space="preserve"> </w:t>
+      </w:r>
+      <w:r>
+        <w:t xml:space="preserve">runs it on a robot, updates, repeats. Thousands of cycles a day. The unsettling</w:t>
+      </w:r>
+      <w:r>
+        <w:t xml:space="preserve"> </w:t>
+      </w:r>
+      <w:r>
+        <w:t xml:space="preserve">version: it discovers and exploits a new effect without ever translating the</w:t>
+      </w:r>
+      <w:r>
+        <w:t xml:space="preserve"> </w:t>
+      </w:r>
+      <w:r>
+        <w:t xml:space="preserve">law into human language. We get the room-temperature superconductor; the</w:t>
+      </w:r>
+      <w:r>
+        <w:t xml:space="preserve"> </w:t>
+      </w:r>
+      <w:r>
+        <w:t xml:space="preserve">theory stays in the latent space.</w:t>
+      </w:r>
+    </w:p>
+    <w:p>
+      <w:pPr>
+        <w:pStyle w:val="Compact"/>
+        <w:numPr>
+          <w:ilvl w:val="0"/>
+          <w:numId w:val="1002"/>
+        </w:numPr>
+      </w:pPr>
+      <w:r>
+        <w:rPr>
+          <w:b/>
+          <w:bCs/>
+        </w:rPr>
+        <w:t xml:space="preserve">Spacetime as an error-correcting code.</w:t>
+      </w:r>
+      <w:r>
+        <w:t xml:space="preserve"> </w:t>
+      </w:r>
+      <w:r>
+        <w:t xml:space="preserve">Quantum entanglement may be what</w:t>
+      </w:r>
+      <w:r>
+        <w:t xml:space="preserve"> </w:t>
+      </w:r>
+      <w:r>
+        <w:t xml:space="preserve">stitches geometry together; gravity may be what the code does when you stress</w:t>
+      </w:r>
+      <w:r>
+        <w:t xml:space="preserve"> </w:t>
+      </w:r>
+      <w:r>
+        <w:t xml:space="preserve">it. Then the ultimate probe of quantum gravity is not a bigger collider but a</w:t>
+      </w:r>
+      <w:r>
+        <w:t xml:space="preserve"> </w:t>
+      </w:r>
+      <w:r>
+        <w:t xml:space="preserve">quantum circuit that pushes the entanglement until geometry glitches. This is</w:t>
+      </w:r>
+      <w:r>
+        <w:t xml:space="preserve"> </w:t>
+      </w:r>
+      <w:r>
+        <w:t xml:space="preserve">a real research programme (AdS/CFT,</w:t>
+      </w:r>
+      <w:r>
+        <w:t xml:space="preserve"> </w:t>
+      </w:r>
+      <w:r>
+        <w:t xml:space="preserve">“It from Qubit”</w:t>
+      </w:r>
+      <w:r>
+        <w:t xml:space="preserve">), and it is also the point</w:t>
+      </w:r>
+      <w:r>
+        <w:t xml:space="preserve"> </w:t>
+      </w:r>
+      <w:r>
+        <w:t xml:space="preserve">where</w:t>
+      </w:r>
+      <w:r>
+        <w:t xml:space="preserve"> </w:t>
+      </w:r>
+      <w:r>
+        <w:t xml:space="preserve">“spacetime is a container”</w:t>
+      </w:r>
+      <w:r>
+        <w:t xml:space="preserve"> </w:t>
+      </w:r>
+      <w:r>
+        <w:t xml:space="preserve">starts to sound like folk metaphysics.</w:t>
+      </w:r>
+    </w:p>
+    <w:p>
+      <w:pPr>
+        <w:pStyle w:val="Compact"/>
+        <w:numPr>
+          <w:ilvl w:val="0"/>
+          <w:numId w:val="1002"/>
+        </w:numPr>
+      </w:pPr>
+      <w:r>
+        <w:rPr>
+          <w:b/>
+          <w:bCs/>
+        </w:rPr>
+        <w:t xml:space="preserve">Cosmological archaeology.</w:t>
+      </w:r>
+      <w:r>
+        <w:t xml:space="preserve"> </w:t>
+      </w:r>
+      <w:r>
+        <w:t xml:space="preserve">The only collider that ever reached Planck</w:t>
+      </w:r>
+      <w:r>
+        <w:t xml:space="preserve"> </w:t>
+      </w:r>
+      <w:r>
+        <w:t xml:space="preserve">energies was the early universe. If AI can compute the higher-order</w:t>
+      </w:r>
+      <w:r>
+        <w:t xml:space="preserve"> </w:t>
+      </w:r>
+      <w:r>
+        <w:t xml:space="preserve">correlations in the cosmic microwave background and match them against</w:t>
+      </w:r>
+      <w:r>
+        <w:t xml:space="preserve"> </w:t>
+      </w:r>
+      <w:r>
+        <w:t xml:space="preserve">surveys, we read the universe as a frozen hologram of the physics that made</w:t>
+      </w:r>
+      <w:r>
+        <w:t xml:space="preserve"> </w:t>
+      </w:r>
+      <w:r>
+        <w:t xml:space="preserve">it. No new accelerator; just better forensics.</w:t>
+      </w:r>
+    </w:p>
+    <w:p>
+      <w:pPr>
+        <w:pStyle w:val="Compact"/>
+        <w:numPr>
+          <w:ilvl w:val="0"/>
+          <w:numId w:val="1002"/>
+        </w:numPr>
+      </w:pPr>
+      <w:r>
+        <w:rPr>
+          <w:b/>
+          <w:bCs/>
+        </w:rPr>
+        <w:t xml:space="preserve">The unreadable law.</w:t>
+      </w:r>
+      <w:r>
+        <w:t xml:space="preserve"> </w:t>
+      </w:r>
+      <w:r>
+        <w:t xml:space="preserve">Physics has a beauty bias because simple laws were</w:t>
+      </w:r>
+      <w:r>
+        <w:t xml:space="preserve"> </w:t>
+      </w:r>
+      <w:r>
+        <w:t xml:space="preserve">the ones human brains could hold. If the final theory is a recursive,</w:t>
+      </w:r>
+      <w:r>
+        <w:t xml:space="preserve"> </w:t>
+      </w:r>
+      <w:r>
+        <w:t xml:space="preserve">million-parameter object with no closed form, it can be discovered, verified</w:t>
+      </w:r>
+      <w:r>
+        <w:t xml:space="preserve"> </w:t>
+      </w:r>
+      <w:r>
+        <w:t xml:space="preserve">and used by machines while remaining opaque to us. Egan’s</w:t>
+      </w:r>
+      <w:r>
+        <w:t xml:space="preserve"> </w:t>
+      </w:r>
+      <w:r>
+        <w:rPr>
+          <w:i/>
+          <w:iCs/>
+        </w:rPr>
+        <w:t xml:space="preserve">Diaspora</w:t>
+      </w:r>
+      <w:r>
+        <w:t xml:space="preserve"> </w:t>
+      </w:r>
+      <w:r>
+        <w:t xml:space="preserve">called</w:t>
+      </w:r>
+      <w:r>
+        <w:t xml:space="preserve"> </w:t>
+      </w:r>
+      <w:r>
+        <w:t xml:space="preserve">it; the dog at the radio tower is the polite version.</w:t>
+      </w:r>
+    </w:p>
+    <w:p>
+      <w:pPr>
+        <w:pStyle w:val="FirstParagraph"/>
+      </w:pPr>
+      <w:r>
+        <w:t xml:space="preserve">The honest position: the first is engineering, the second is a research</w:t>
+      </w:r>
+      <w:r>
+        <w:t xml:space="preserve"> </w:t>
+      </w:r>
+      <w:r>
+        <w:t xml:space="preserve">programme, the third is a data problem, the fourth is a possibility. None of</w:t>
+      </w:r>
+      <w:r>
+        <w:t xml:space="preserve"> </w:t>
+      </w:r>
+      <w:r>
+        <w:t xml:space="preserve">them changes the ordering argument. All of them make the physics-last claim</w:t>
+      </w:r>
+      <w:r>
+        <w:t xml:space="preserve"> </w:t>
+      </w:r>
+      <w:r>
+        <w:t xml:space="preserve">less comfortable: the last domain may not end with a human-readable answer.</w:t>
+      </w:r>
+    </w:p>
+    <w:bookmarkEnd w:id="15"/>
+    <w:bookmarkStart w:id="16" w:name="understanding-is-maths-soul"/>
+    <w:p>
+      <w:pPr>
+        <w:pStyle w:val="Heading2"/>
+      </w:pPr>
+      <w:r>
         <w:t xml:space="preserve">“Understanding”</w:t>
       </w:r>
       <w:r>
@@ -1020,8 +1508,8 @@
         <w:t xml:space="preserve">liturgy again.</w:t>
       </w:r>
     </w:p>
-    <w:bookmarkEnd w:id="14"/>
-    <w:bookmarkStart w:id="15" w:name="where-it-slots"/>
+    <w:bookmarkEnd w:id="16"/>
+    <w:bookmarkStart w:id="17" w:name="where-it-slots"/>
     <w:p>
       <w:pPr>
         <w:pStyle w:val="Heading2"/>
@@ -1156,8 +1644,8 @@
         <w:t xml:space="preserve">the most hopeful sentence in this book, and it belongs to the coldest chapter.</w:t>
       </w:r>
     </w:p>
-    <w:bookmarkEnd w:id="15"/>
-    <w:bookmarkStart w:id="17" w:name="the-chain-granted-tested-kept"/>
+    <w:bookmarkEnd w:id="17"/>
+    <w:bookmarkStart w:id="19" w:name="the-chain-granted-tested-kept"/>
     <w:p>
       <w:pPr>
         <w:pStyle w:val="Heading2"/>
@@ -1508,7 +1996,7 @@
         <w:rPr>
           <w:rStyle w:val="FootnoteReference"/>
         </w:rPr>
-        <w:footnoteReference w:id="16"/>
+        <w:footnoteReference w:id="18"/>
       </w:r>
     </w:p>
     <w:p>
@@ -1555,8 +2043,8 @@
         <w:t xml:space="preserve">describing bandwidth.</w:t>
       </w:r>
     </w:p>
-    <w:bookmarkEnd w:id="17"/>
-    <w:bookmarkStart w:id="18" w:name="fleet-link"/>
+    <w:bookmarkEnd w:id="19"/>
+    <w:bookmarkStart w:id="20" w:name="fleet-link"/>
     <w:p>
       <w:pPr>
         <w:pStyle w:val="Heading2"/>
@@ -1609,8 +2097,8 @@
         <w:t xml:space="preserve">has been empty since the checker learned to read.</w:t>
       </w:r>
     </w:p>
-    <w:bookmarkEnd w:id="18"/>
-    <w:bookmarkEnd w:id="19"/>
+    <w:bookmarkEnd w:id="20"/>
+    <w:bookmarkEnd w:id="21"/>
     <w:sectPr>
       <w:footnotePr>
         <w:numRestart w:val="eachSect"/>
@@ -1640,7 +2128,7 @@
       </w:r>
     </w:p>
   </w:footnote>
-  <w:footnote w:id="16">
+  <w:footnote w:id="18">
     <w:p>
       <w:pPr>
         <w:pStyle w:val="FootnoteText"/>
@@ -1859,6 +2347,9 @@
     <w:abstractNumId w:val="990"/>
   </w:num>
   <w:num w:numId="1001">
+    <w:abstractNumId w:val="991"/>
+  </w:num>
+  <w:num w:numId="1002">
     <w:abstractNumId w:val="991"/>
   </w:num>
 </w:numbering>

</xml_diff>